<commit_message>
docs: fix report pagination and duplicate text
</commit_message>
<xml_diff>
--- a/final_project/MoeBubbleBattle/report/程序设计课程实践报告-待填写姓名.docx
+++ b/final_project/MoeBubbleBattle/report/程序设计课程实践报告-待填写姓名.docx
@@ -6555,34 +6555,6 @@
     </w:p>
     <w:p>
       <w:pPr>
-        <w:spacing w:line="300" w:lineRule="auto" w:after="0"/>
-        <w:ind w:firstLine="480"/>
-        <w:jc w:val="both"/>
-      </w:pPr>
-      <w:r>
-        <w:rPr>
-          <w:rFonts w:ascii="Times New Roman" w:hAnsi="Times New Roman" w:eastAsia="宋体"/>
-          <w:sz w:val="24"/>
-        </w:rPr>
-        <w:t>其次是连续碰撞与边界值。挡板必须限制在0到窗口宽度减挡板宽度之间，球的圆心必须考虑半径，游戏角色的碰撞盒则不能直接等同于帽子和背包的可见范围。最终项目使用约20×20像素的脚底碰撞盒，显示精灵仍可覆盖44像素步道；转角时根据角色与当前格中心的偏差做有限纠正，使碰撞严格性和操作流畅度兼顾。人物动画在左右跨步之间插入回中帧，并缩小跨步帧与校正重心，解决了原来左右摆动过大的问题。</w:t>
-      </w:r>
-    </w:p>
-    <w:p>
-      <w:pPr>
-        <w:spacing w:line="300" w:lineRule="auto" w:after="0"/>
-        <w:ind w:firstLine="480"/>
-        <w:jc w:val="both"/>
-      </w:pPr>
-      <w:r>
-        <w:rPr>
-          <w:rFonts w:ascii="Times New Roman" w:hAnsi="Times New Roman" w:eastAsia="宋体"/>
-          <w:sz w:val="24"/>
-        </w:rPr>
-        <w:t>再次是动态对象存储和清理。水泡、水浪、道具和粒子数量随操作不断变化，固定数组难以管理，因此使用std::vector追加对象；对象失效后先标记active=false，再在统一清理阶段用std::remove_if和erase删除，避免遍历过程中直接删除导致迭代器失效。敌人包含多个派生类型，使用std::vector&lt;std::unique_ptr&lt;Enemy&gt;&gt;既能通过基类指针调用虚函数，又能在擦除时自动释放真实派生对象。随机地图、道具掉落和AI方向使用std::mt19937与标准分布，并设置固定种子，便于重复测试同一关卡。</w:t>
-      </w:r>
-    </w:p>
-    <w:p>
-      <w:pPr>
         <w:pStyle w:val="3"/>
         <w:rPr>
           <w:rFonts w:ascii="黑体" w:eastAsia="黑体" w:hAnsi="黑体" w:hint="eastAsia"/>
@@ -7557,6 +7529,7 @@
       <w:tr>
         <w:trPr>
           <w:tblHeader w:val="true"/>
+          <w:cantSplit/>
         </w:trPr>
         <w:tc>
           <w:tcPr>
@@ -7641,6 +7614,9 @@
         </w:tc>
       </w:tr>
       <w:tr>
+        <w:trPr>
+          <w:cantSplit/>
+        </w:trPr>
         <w:tc>
           <w:tcPr>
             <w:tcW w:type="dxa" w:w="1944"/>
@@ -7721,6 +7697,9 @@
         </w:tc>
       </w:tr>
       <w:tr>
+        <w:trPr>
+          <w:cantSplit/>
+        </w:trPr>
         <w:tc>
           <w:tcPr>
             <w:tcW w:type="dxa" w:w="1944"/>
@@ -7801,6 +7780,9 @@
         </w:tc>
       </w:tr>
       <w:tr>
+        <w:trPr>
+          <w:cantSplit/>
+        </w:trPr>
         <w:tc>
           <w:tcPr>
             <w:tcW w:type="dxa" w:w="1944"/>
@@ -7881,6 +7863,9 @@
         </w:tc>
       </w:tr>
       <w:tr>
+        <w:trPr>
+          <w:cantSplit/>
+        </w:trPr>
         <w:tc>
           <w:tcPr>
             <w:tcW w:type="dxa" w:w="1944"/>
@@ -7961,6 +7946,9 @@
         </w:tc>
       </w:tr>
       <w:tr>
+        <w:trPr>
+          <w:cantSplit/>
+        </w:trPr>
         <w:tc>
           <w:tcPr>
             <w:tcW w:type="dxa" w:w="1944"/>
@@ -9511,6 +9499,7 @@
           <w:trHeight w:val="591"/>
           <w:jc w:val="center"/>
           <w:tblHeader w:val="true"/>
+          <w:cantSplit/>
         </w:trPr>
         <w:tc>
           <w:tcPr>
@@ -9673,6 +9662,7 @@
         <w:trPr>
           <w:trHeight w:val="603"/>
           <w:jc w:val="center"/>
+          <w:cantSplit/>
         </w:trPr>
         <w:tc>
           <w:tcPr>
@@ -9835,6 +9825,7 @@
         <w:trPr>
           <w:trHeight w:val="591"/>
           <w:jc w:val="center"/>
+          <w:cantSplit/>
         </w:trPr>
         <w:tc>
           <w:tcPr>
@@ -9997,6 +9988,7 @@
         <w:trPr>
           <w:trHeight w:val="591"/>
           <w:jc w:val="center"/>
+          <w:cantSplit/>
         </w:trPr>
         <w:tc>
           <w:tcPr>
@@ -10159,6 +10151,7 @@
         <w:trPr>
           <w:trHeight w:val="603"/>
           <w:jc w:val="center"/>
+          <w:cantSplit/>
         </w:trPr>
         <w:tc>
           <w:tcPr>
@@ -10321,6 +10314,7 @@
         <w:trPr>
           <w:trHeight w:val="591"/>
           <w:jc w:val="center"/>
+          <w:cantSplit/>
         </w:trPr>
         <w:tc>
           <w:tcPr>
@@ -10483,6 +10477,7 @@
         <w:trPr>
           <w:trHeight w:val="591"/>
           <w:jc w:val="center"/>
+          <w:cantSplit/>
         </w:trPr>
         <w:tc>
           <w:tcPr>
@@ -10645,6 +10640,7 @@
         <w:trPr>
           <w:trHeight w:val="603"/>
           <w:jc w:val="center"/>
+          <w:cantSplit/>
         </w:trPr>
         <w:tc>
           <w:tcPr>
@@ -10807,6 +10803,7 @@
         <w:trPr>
           <w:trHeight w:val="603"/>
           <w:jc w:val="center"/>
+          <w:cantSplit/>
         </w:trPr>
         <w:tc>
           <w:tcPr>
@@ -10969,6 +10966,7 @@
         <w:trPr>
           <w:trHeight w:val="603"/>
           <w:jc w:val="center"/>
+          <w:cantSplit/>
         </w:trPr>
         <w:tc>
           <w:tcPr>
@@ -11131,6 +11129,7 @@
         <w:trPr>
           <w:trHeight w:val="603"/>
           <w:jc w:val="center"/>
+          <w:cantSplit/>
         </w:trPr>
         <w:tc>
           <w:tcPr>
@@ -11290,6 +11289,9 @@
         </w:tc>
       </w:tr>
       <w:tr>
+        <w:trPr>
+          <w:cantSplit/>
+        </w:trPr>
         <w:tc>
           <w:tcPr>
             <w:tcW w:type="dxa" w:w="704"/>
@@ -11448,6 +11450,9 @@
         </w:tc>
       </w:tr>
       <w:tr>
+        <w:trPr>
+          <w:cantSplit/>
+        </w:trPr>
         <w:tc>
           <w:tcPr>
             <w:tcW w:type="dxa" w:w="704"/>
@@ -11606,6 +11611,9 @@
         </w:tc>
       </w:tr>
       <w:tr>
+        <w:trPr>
+          <w:cantSplit/>
+        </w:trPr>
         <w:tc>
           <w:tcPr>
             <w:tcW w:type="dxa" w:w="704"/>
@@ -11764,6 +11772,9 @@
         </w:tc>
       </w:tr>
       <w:tr>
+        <w:trPr>
+          <w:cantSplit/>
+        </w:trPr>
         <w:tc>
           <w:tcPr>
             <w:tcW w:type="dxa" w:w="704"/>
@@ -11922,6 +11933,9 @@
         </w:tc>
       </w:tr>
       <w:tr>
+        <w:trPr>
+          <w:cantSplit/>
+        </w:trPr>
         <w:tc>
           <w:tcPr>
             <w:tcW w:type="dxa" w:w="704"/>
@@ -12080,6 +12094,9 @@
         </w:tc>
       </w:tr>
       <w:tr>
+        <w:trPr>
+          <w:cantSplit/>
+        </w:trPr>
         <w:tc>
           <w:tcPr>
             <w:tcW w:type="dxa" w:w="704"/>
@@ -12238,6 +12255,9 @@
         </w:tc>
       </w:tr>
       <w:tr>
+        <w:trPr>
+          <w:cantSplit/>
+        </w:trPr>
         <w:tc>
           <w:tcPr>
             <w:tcW w:type="dxa" w:w="704"/>
@@ -12396,6 +12416,9 @@
         </w:tc>
       </w:tr>
       <w:tr>
+        <w:trPr>
+          <w:cantSplit/>
+        </w:trPr>
         <w:tc>
           <w:tcPr>
             <w:tcW w:type="dxa" w:w="704"/>
@@ -12554,6 +12577,9 @@
         </w:tc>
       </w:tr>
       <w:tr>
+        <w:trPr>
+          <w:cantSplit/>
+        </w:trPr>
         <w:tc>
           <w:tcPr>
             <w:tcW w:type="dxa" w:w="704"/>
@@ -12712,6 +12738,9 @@
         </w:tc>
       </w:tr>
       <w:tr>
+        <w:trPr>
+          <w:cantSplit/>
+        </w:trPr>
         <w:tc>
           <w:tcPr>
             <w:tcW w:type="dxa" w:w="704"/>

</xml_diff>

<commit_message>
feat: refine HUD, boss balance, and report assets
</commit_message>
<xml_diff>
--- a/final_project/MoeBubbleBattle/report/程序设计课程实践报告-待填写姓名.docx
+++ b/final_project/MoeBubbleBattle/report/程序设计课程实践报告-待填写姓名.docx
@@ -6089,7 +6089,7 @@
           <w:rFonts w:ascii="Times New Roman" w:hAnsi="Times New Roman" w:eastAsia="宋体"/>
           <w:sz w:val="24"/>
         </w:rPr>
-        <w:t>文字输出和动态刷新是第一周的另一个重点。settextstyle、settextcolor、textwidth和textheight共同决定字体、颜色与居中位置；使用TCHAR或宽字符串时必须让项目字符集和函数参数类型保持一致。对于会持续刷新的画面，应使用BeginBatchDraw和FlushBatchDraw，把一帧内容先绘制到缓冲区再整体显示，从而减少直接清屏造成的闪烁。动态时钟每帧读取系统时间，根据小时、分钟和秒数计算角度，再把角度转换为指针端点。这个过程把数学坐标、图形绘制、时间获取和对象职责结合起来，为后续游戏循环奠定了基础。</w:t>
+        <w:t>文字输出和动态刷新是第一周的另一个重点。settextstyle、settextcolor、textwidth和textheight共同决定字体、颜色与居中位置；使用TCHAR或宽字符串时需要让项目字符集和函数参数类型保持一致。对于会持续刷新的画面，应使用BeginBatchDraw和FlushBatchDraw，把一帧内容先绘制到缓冲区再整体显示，从而减少直接清屏造成的闪烁。动态时钟每帧读取系统时间，根据小时、分钟和秒数计算角度，再把角度转换为指针端点。这个过程把数学坐标、图形绘制、时间获取和对象职责结合起来，为后续游戏循环奠定了基础。</w:t>
       </w:r>
     </w:p>
     <w:p>
@@ -6145,7 +6145,7 @@
           <w:rFonts w:ascii="Times New Roman" w:hAnsi="Times New Roman" w:eastAsia="宋体"/>
           <w:sz w:val="24"/>
         </w:rPr>
-        <w:t>第一周最容易出现的问题是字符集和图片路径。补充资料指出，loadimage编译报错通常是项目字符集与字符串实参不匹配；即使编译通过，图片不显示也常由格式或路径造成。我的处理方法是整个解决方案统一使用Unicode字符集，涉及路径时使用std::wstring和宽字符串接口；资源文件统一采用PNG/JPG等EasyX支持的位图格式。最终项目没有写死C盘或D盘绝对路径，而是先取得EXE所在目录，再拼接assets下的英文子目录，同时由项目文件在编译后自动复制资源。这种做法保证工程移动到老师电脑后仍能找到图片。</w:t>
+        <w:t>第一周最容易出现的问题是字符集和图片路径。loadimage编译报错通常是项目字符集与字符串实参不匹配；即使编译通过，图片不显示也常由格式或路径造成。我的处理方法是整个解决方案统一使用Unicode字符集，涉及路径时使用std::wstring和宽字符串接口；资源文件统一采用PNG/JPG等EasyX支持的位图格式。最终项目没有写死C盘或D盘绝对路径，而是先取得EXE所在目录，再拼接assets下的英文子目录，同时由项目文件在编译后自动复制资源。整个输出目录复制到其他电脑后仍能按相对位置找到图片。</w:t>
       </w:r>
     </w:p>
     <w:p>
@@ -7029,7 +7029,7 @@
           <w:rFonts w:ascii="Times New Roman" w:hAnsi="Times New Roman" w:eastAsia="宋体"/>
           <w:sz w:val="24"/>
         </w:rPr>
-        <w:t>敌人与关卡需求：第一关以巡逻敌人为主，第二关加入根据曼哈顿距离追踪玩家的敌人，第三关加入10点生命Boss。普通敌人与Boss共享Enemy接口，Boss每次有效水浪只损失一点生命，血量在顶部状态条和对象头顶同步显示。</w:t>
+        <w:t>敌人与关卡需求：第一关以巡逻敌人为主，第二关加入根据曼哈顿距离追踪玩家的敌人，第三关加入3点生命Boss。普通敌人与Boss共享Enemy接口，Boss每次有效水浪只损失一点生命，血量在顶部状态条和对象头顶同步显示。</w:t>
       </w:r>
     </w:p>
     <w:p>
@@ -8124,7 +8124,7 @@
           <w:rFonts w:ascii="Times New Roman" w:hAnsi="Times New Roman" w:eastAsia="宋体"/>
           <w:sz w:val="24"/>
         </w:rPr>
-        <w:t>以下画面由当前Release x64程序的--capture-report模式自动绘制并保存，和提交工程使用同一套渲染函数与资源，不是概念占位图。</w:t>
+        <w:t>以下画面由当前Release x64程序的--capture-report模式自动绘制并保存，与正常运行使用同一套渲染函数和资源，不是概念占位图。</w:t>
       </w:r>
     </w:p>
     <w:p>
@@ -9449,7 +9449,7 @@
           <w:rFonts w:ascii="Times New Roman" w:hAnsi="Times New Roman" w:eastAsia="宋体"/>
           <w:sz w:val="24"/>
         </w:rPr>
-        <w:t>测试覆盖构建配置、界面资源、输入兼容、地图边界、碰撞、连锁爆炸、强化上限、图片相对路径、角色差异和Boss多段受击。自动构建与报告截图能够直接证明的项目标记为通过，其余交互边界在最终提交前按表逐项人工复核。</w:t>
+        <w:t>测试覆盖构建配置、界面资源、输入兼容、地图边界、碰撞、连锁爆炸、强化上限、图片相对路径、角色差异和Boss多段受击。自动构建与报告截图能够直接证明的项目标记为通过，其余交互边界需要结合实际运行按表逐项复核。</w:t>
       </w:r>
     </w:p>
     <w:p>
@@ -12223,7 +12223,7 @@
                 <w:rFonts w:ascii="Times New Roman" w:hAnsi="Times New Roman" w:eastAsia="宋体"/>
                 <w:sz w:val="17"/>
               </w:rPr>
-              <w:t>最大生命10，两处血量一致</w:t>
+              <w:t>最大生命3，两处血量一致</w:t>
             </w:r>
           </w:p>
         </w:tc>
@@ -12962,18 +12962,8 @@
           <w:rFonts w:ascii="Times New Roman" w:hAnsi="Times New Roman" w:eastAsia="宋体"/>
           <w:sz w:val="24"/>
         </w:rPr>
-        <w:t>本项目完成了一个可独立运行的EasyX单人网格闯关游戏，并在课程要求的基础上加入四名差异化角色、多血量Boss、鼠标菜单、原创透明道具图标、行走精灵、背景音乐、音效、粒子效果、三关统计与自动报告截图。工程采用Visual Studio解决方案管理，Debug/Release和Win32/x64四种配置均能编译，资源通过项目目标自动复制，不依赖本机绝对路径。整体功能规模、界面完整度和可演示性达到最初设计目标。开发中最关键的技术难点有三个。第一是移动碰撞与操作手感：可见精灵比通道宽时容易卡墙，因此将碰撞范围收缩为脚底区域，并在转角处按格中心进行有限纠偏；动画方面在左右跨步之间插入回中帧，降低摆动。第二是动态对象与连锁爆炸：水泡、水浪、道具、粒子和敌人的数量不断变化，通过vector统一存储、active延迟失效和remove_if集中清理，避免遍历中删除；水浪传播严格区分固定墙、木箱和其他水泡。第三是面向对象扩展：使用GameObject、Character、Enemy三级抽象复用公共能力，Boss通过重写受击、得分和AI接口加入主循环，不需要在每个更新阶段判断具体类型。项目对封装、继承和多态进行了实际应用，而不是只在报告中描述。地图、玩家与对象状态均为私有数据，公开方法负责保持边界和上限；派生敌人复用基类移动、碰撞与危险格判断；vector&lt;unique_ptr&lt;Enemy&gt;&gt;使普通敌人和Boss能够在同一容器中运行时分派。std::array适合固定地图和键盘状态，std::vector适合动态对象，std::mt19937使随机关卡可复现，标准算法减少了手写查找和清理代码。目前仍可继续改进：AI使用局部评分而不是完整寻路，在复杂木箱布局下可能选择次优路线；音乐使用简单波形生成，层次和循环衔接仍可提升；报告测试表中的鼠标、极限碰撞和Boss连续命中项目需要在提交前完成最后人工点测。后续可以加入A*寻路、关卡编辑器、可保存最高分、更多Boss阶段和资源预加载缓存。在本次实践中，我从基本图元、消息输入和双缓冲逐步过渡到完整游戏循环与对象体系，理解了图形程序不仅是把画面画出来，更重要的是让数据结构、对象职责、状态转换、资源路径和测试证据保持一致。</w:t>
-      </w:r>
-    </w:p>
-    <w:p>
-      <w:pPr>
-        <w:spacing w:line="300" w:lineRule="auto"/>
-        <w:rPr>
-          <w:rFonts w:ascii="宋体" w:eastAsia="宋体" w:hAnsi="宋体" w:hint="eastAsia"/>
-          <w:sz w:val="24"/>
-          <w:szCs w:val="24"/>
-        </w:rPr>
-      </w:pPr>
+        <w:t>本项目完成了一个可独立运行的EasyX单人网格闯关游戏，包含四名差异化角色、多血量Boss、鼠标菜单、原创透明道具图标、行走精灵、背景音乐、音效、粒子效果、三关统计与自动报告截图。工程采用Visual Studio解决方案管理，Debug/Release和Win32/x64四种配置均能编译，资源通过项目目标自动复制，不依赖本机绝对路径。整体功能规模、界面完整度和可演示性达到最初设计目标。开发中最关键的技术难点有三个。第一是移动碰撞与操作手感：可见精灵比通道宽时容易卡墙，因此将碰撞范围收缩为脚底区域，并在转角处按格中心进行有限纠偏；动画方面在左右跨步之间插入回中帧，降低摆动。第二是动态对象与连锁爆炸：水泡、水浪、道具、粒子和敌人的数量不断变化，通过vector统一存储、active延迟失效和remove_if集中清理，避免遍历中删除；水浪传播严格区分固定墙、木箱和其他水泡。第三是面向对象扩展：使用GameObject、Character、Enemy三级抽象复用公共能力，Boss通过重写受击、得分和AI接口加入主循环，不需要在每个更新阶段判断具体类型。项目对封装、继承和多态进行了实际应用，而不是只在报告中描述。地图、玩家与对象状态均为私有数据，公开方法负责保持边界和上限；派生敌人复用基类移动、碰撞与危险格判断；vector&lt;unique_ptr&lt;Enemy&gt;&gt;使普通敌人和Boss能够在同一容器中运行时分派。std::array适合固定地图和键盘状态，std::vector适合动态对象，std::mt19937使随机关卡可复现，标准算法减少了手写查找和清理代码。目前仍可继续改进：AI使用局部评分而不是完整寻路，在复杂木箱布局下可能选择次优路线；音乐使用简单波形生成，层次和循环衔接仍可提升；鼠标、极限碰撞和Boss连续命中等交互边界仍需结合实际运行逐项复核。后续可加入A*寻路和关卡编辑器。本次实践让我从基本图元与消息输入逐步过渡到完整游戏循环，也认识到画面、数据结构、对象职责、状态转换与资源路径需要保持一致。</w:t>
+      </w:r>
     </w:p>
     <w:sectPr>
       <w:headerReference w:type="default" r:id="rId13"/>

</xml_diff>

<commit_message>
docs: polish report layout and align boss materials
</commit_message>
<xml_diff>
--- a/final_project/MoeBubbleBattle/report/程序设计课程实践报告-待填写姓名.docx
+++ b/final_project/MoeBubbleBattle/report/程序设计课程实践报告-待填写姓名.docx
@@ -6589,18 +6589,6 @@
           <w:sz w:val="24"/>
         </w:rPr>
         <w:t>案例一是鼠标键盘绘图程序。左键绘制正方形、右键绘制圆形，R/G/B/W切换颜色，按住Ctrl增大图形。Shape作为抽象基类只规定draw行为，Square和Circle重写具体图元；DrawingApp负责窗口与消息分发。新增图形类型时只需实现Shape，而不需要修改鼠标事件的主要流程，这一案例直观体现了接口抽象和运行时多态。</w:t>
-      </w:r>
-    </w:p>
-    <w:p>
-      <w:pPr>
-        <w:widowControl/>
-        <w:jc w:val="left"/>
-        <w:rPr>
-          <w:rFonts w:hint="eastAsia"/>
-        </w:rPr>
-      </w:pPr>
-      <w:r>
-        <w:br w:type="page"/>
       </w:r>
     </w:p>
     <w:p>

</xml_diff>